<commit_message>
Update Porto motivation letter and outgoing email draft to include all mapped subjects and UPT agreement codes (061/041)
</commit_message>
<xml_diff>
--- a/motivation_letter_porto.docx
+++ b/motivation_letter_porto.docx
@@ -53,7 +53,7 @@
         <w:spacing w:line="276" w:lineRule="auto" w:after="240"/>
       </w:pPr>
       <w:r>
-        <w:t>I am writing to formally express my strong interest in participating in the Erasmus+ exchange program at Universidade Portucalense (UPT) in Porto, Portugal, for the Fall semester of the 2026/2027 academic year. As a BSc Informatics student at the Czech University of Life Sciences Prague (CZU) who also works professionally as a software developer and data analyst, I am eager to combine my technical experience with UPT's outstanding curriculum in Informatics Engineering and Management.</w:t>
+        <w:t>I am writing to formally express my strong interest in participating in the Erasmus+ exchange program at Universidade Portucalense (UPT) in Porto, Portugal, for the Fall semester of the 2026/2027 academic year. As a BSc Informatics student at the Czech University of Life Sciences Prague (CZU) who also works professionally as a software developer and data analyst, I am eager to combine my practical industry experience with UPT's outstanding academic offerings under the bilateral agreements for both Information and Communication Technologies (ICTs - 061) and Business and Administration (041).</w:t>
       </w:r>
     </w:p>
     <w:p>
@@ -61,7 +61,7 @@
         <w:spacing w:line="276" w:lineRule="auto" w:after="240"/>
       </w:pPr>
       <w:r>
-        <w:t>UPT is my top-choice host institution because its course offerings align perfectly with my degree requirements. I plan to enroll in core subjects that serve as direct equivalents to my CZU courses: Sistemas Operativos, Tecnologias Web, Estatística e Análise de Dados, and Contabilidade Geral. The opportunity to study these in UPT's English-supported academic environment will allow me to maintain my double-focus in software engineering and business informatics without delaying my academic progress. Having worked as a developer, I understand that bridging system-level programming with data-driven analytics is crucial, and UPT's syllabus provides precisely this balance.</w:t>
+        <w:t>UPT Porto is my top-choice host institution because its course catalog allows for cross-departmental selection, which aligns perfectly with my double-focus on software systems and business informatics. I have mapped six core and elective subjects that serve as direct equivalents to my remaining CZU degree requirements: EIE69E UNIX Operating Systems (equivalent to Sistemas Operativos - 6 ECTS), ETE3AE Web Design (equivalent to Tecnologias Web - 6 ECTS), ESE48E Statistics (equivalent to Estatística e Análise de Dados - 6 ECTS), EIE96E Fundamentals of Accounting (equivalent to Contabilidade Geral - 6 ECTS), EEEI2E Business Economics (equivalent to Economia da Empresa - 6 ECTS), and EIE96E Interaction Design (equivalent to Conceção de Interfaces - 6 ECTS). Studying these in UPT's English-supported academic environment will allow me to maintain my graduation timeline while deepening my professional skill set.</w:t>
       </w:r>
     </w:p>
     <w:p>
@@ -69,7 +69,7 @@
         <w:spacing w:line="276" w:lineRule="auto" w:after="240"/>
       </w:pPr>
       <w:r>
-        <w:t>Beyond academics, Porto is a fantastic cultural and personal fit. Having lived and worked in Prague as a Turkish national, I am highly independent and experienced in managing international relocations. I will be traveling with my pet cat, which requires diligent logistical and veterinary planning (including managing TAP Air Portugal's cabin weight limits), and I have already secured the necessary medical certifications. In my free time, I look forward to engaging with Porto's vibrant student community, participating in ESN activities, and training at local bouldering facilities like São Rock Climbing and Proa Climbing Center.</w:t>
+        <w:t>Beyond academics, Porto is a fantastic cultural and personal fit. Having lived and worked in Prague as a Turkish national, I am highly independent and experienced in managing international relocations under Directive 2016/801 student mobility frameworks. I will be relocating with my pet cat, Turuncu (Çu), which requires responsible veterinary preparation (including ISO microchipping, rabies vaccination, and EU Pet Passport coordination). In my free time, I look forward to engaging with Porto's active student community, participating in ESN activities, and training at local climbing facilities like São Rock Climbing and Proa Climbing Center.</w:t>
       </w:r>
     </w:p>
     <w:p>
@@ -77,7 +77,7 @@
         <w:spacing w:line="276" w:lineRule="auto" w:after="240"/>
       </w:pPr>
       <w:r>
-        <w:t>I am confident that my technical skills, professional drive, and adaptability make me a strong candidate for this exchange and a positive representative for both CZU Prague and UPT Porto. Thank you for considering my application. I look forward to the possibility of studying at Universidade Portucalense.</w:t>
+        <w:t>I am confident that my software engineering background, academic diligence, and adaptability will make me a strong addition to UPT Porto and a proud representative of CZU Prague. Thank you for considering my application. I look forward to the possibility of studying at Universidade Portucalense.</w:t>
       </w:r>
     </w:p>
     <w:p/>

</xml_diff>